<commit_message>
add pdf version of script
</commit_message>
<xml_diff>
--- a/Kursskript.docx
+++ b/Kursskript.docx
@@ -134,7 +134,7 @@
         <w:rPr>
           <w:noProof/>
         </w:rPr>
-        <w:t>5. Juni 2025</w:t>
+        <w:t>6. Juni 2025</w:t>
       </w:r>
       <w:r>
         <w:fldChar w:fldCharType="end"/>
@@ -2427,7 +2427,7 @@
           <v:shape id="_x0000_i1028" type="#_x0000_t75" alt="" style="width:453.9pt;height:80.85pt;mso-width-percent:0;mso-height-percent:0;mso-width-percent:0;mso-height-percent:0" o:ole="">
             <v:imagedata r:id="rId15" o:title=""/>
           </v:shape>
-          <o:OLEObject Type="Embed" ProgID="Word.Document.12" ShapeID="_x0000_i1028" DrawAspect="Content" ObjectID="_1810647637" r:id="rId16">
+          <o:OLEObject Type="Embed" ProgID="Word.Document.12" ShapeID="_x0000_i1028" DrawAspect="Content" ObjectID="_1810729324" r:id="rId16">
             <o:FieldCodes>\s</o:FieldCodes>
           </o:OLEObject>
         </w:object>
@@ -2941,7 +2941,7 @@
           <v:shape id="_x0000_i1027" type="#_x0000_t75" alt="" style="width:453.9pt;height:68.85pt;mso-width-percent:0;mso-height-percent:0;mso-width-percent:0;mso-height-percent:0" o:ole="">
             <v:imagedata r:id="rId17" o:title=""/>
           </v:shape>
-          <o:OLEObject Type="Embed" ProgID="Word.Document.12" ShapeID="_x0000_i1027" DrawAspect="Content" ObjectID="_1810647638" r:id="rId18">
+          <o:OLEObject Type="Embed" ProgID="Word.Document.12" ShapeID="_x0000_i1027" DrawAspect="Content" ObjectID="_1810729325" r:id="rId18">
             <o:FieldCodes>\s</o:FieldCodes>
           </o:OLEObject>
         </w:object>
@@ -3059,7 +3059,7 @@
           <v:shape id="_x0000_i1026" type="#_x0000_t75" alt="" style="width:453.9pt;height:122.1pt;mso-width-percent:0;mso-height-percent:0;mso-width-percent:0;mso-height-percent:0" o:ole="">
             <v:imagedata r:id="rId19" o:title=""/>
           </v:shape>
-          <o:OLEObject Type="Embed" ProgID="Word.Document.12" ShapeID="_x0000_i1026" DrawAspect="Content" ObjectID="_1810647639" r:id="rId20">
+          <o:OLEObject Type="Embed" ProgID="Word.Document.12" ShapeID="_x0000_i1026" DrawAspect="Content" ObjectID="_1810729326" r:id="rId20">
             <o:FieldCodes>\s</o:FieldCodes>
           </o:OLEObject>
         </w:object>
@@ -3933,7 +3933,7 @@
           <v:shape id="_x0000_i1025" type="#_x0000_t75" alt="" style="width:453.9pt;height:243.15pt;mso-width-percent:0;mso-height-percent:0;mso-width-percent:0;mso-height-percent:0" o:ole="">
             <v:imagedata r:id="rId22" o:title=""/>
           </v:shape>
-          <o:OLEObject Type="Embed" ProgID="Word.Document.12" ShapeID="_x0000_i1025" DrawAspect="Content" ObjectID="_1810647640" r:id="rId23">
+          <o:OLEObject Type="Embed" ProgID="Word.Document.12" ShapeID="_x0000_i1025" DrawAspect="Content" ObjectID="_1810729327" r:id="rId23">
             <o:FieldCodes>\s</o:FieldCodes>
           </o:OLEObject>
         </w:object>
@@ -3948,7 +3948,13 @@
         <w:t>A</w:t>
       </w:r>
       <w:r>
-        <w:t>ufgabe 8: Datenauswertung mit Python</w:t>
+        <w:t xml:space="preserve">ufgabe </w:t>
+      </w:r>
+      <w:r>
+        <w:t>6</w:t>
+      </w:r>
+      <w:r>
+        <w:t>: Datenauswertung mit Python</w:t>
       </w:r>
       <w:bookmarkEnd w:id="15"/>
     </w:p>
@@ -8086,6 +8092,7 @@
   <w:style w:type="character" w:default="1" w:styleId="Absatz-Standardschriftart">
     <w:name w:val="Default Paragraph Font"/>
     <w:uiPriority w:val="1"/>
+    <w:semiHidden/>
     <w:unhideWhenUsed/>
   </w:style>
   <w:style w:type="table" w:default="1" w:styleId="NormaleTabelle">

</xml_diff>